<commit_message>
Migra pruebas a Vitest y las ubica junto a cada componente
</commit_message>
<xml_diff>
--- a/docs/ERS_v2.docx
+++ b/docs/ERS_v2.docx
@@ -20,7 +20,7 @@
     </w:p>
     <w:p>
       <w:r>
-        <w:t>MiTienda  |  Full Stack II  |  Versión 2  |  21 de octubre de 2026</w:t>
+        <w:t>MiTienda  |  Full Stack II  |  Versión 2  |  23 de octubre de 2026</w:t>
       </w:r>
     </w:p>
     <w:p>
@@ -348,7 +348,7 @@
     </w:p>
     <w:p>
       <w:r>
-        <w:t>Node.js 24 o superior ejecuta las herramientas y Jasmine. React presenta las vistas, React Router administra las rutas y los contextos comparten productos, categorías, carrito, pedidos y sesión. El CSS adapta la tienda a escritorio y móvil.</w:t>
+        <w:t>Node.js 24 o superior ejecuta las herramientas y Vitest. React presenta las vistas, React Router administra las rutas y los contextos comparten productos, categorías, carrito, pedidos y sesión. El CSS adapta la tienda a escritorio y móvil.</w:t>
       </w:r>
     </w:p>
     <w:p>
@@ -2472,7 +2472,7 @@
                 <w:color w:val="FFFFFF"/>
                 <w:sz w:val="19"/>
               </w:rPr>
-              <w:t>Casos Jasmine</w:t>
+              <w:t>Casos Vitest</w:t>
             </w:r>
           </w:p>
         </w:tc>
@@ -3126,7 +3126,7 @@
     </w:p>
     <w:p>
       <w:r>
-        <w:t>La entrega debe incluir código en una rama de trabajo, lockfile, pruebas Jasmine ejecutables, informe de cobertura con métricas y brechas, propuesta de pruebas y este ERS. El código se revisa localmente antes de publicar.</w:t>
+        <w:t>La entrega debe incluir código en una rama de trabajo, lockfile, pruebas Vitest ejecutables, informe de cobertura con métricas y brechas, propuesta de pruebas y este ERS. El código se revisa localmente antes de publicar.</w:t>
       </w:r>
     </w:p>
     <w:p>
@@ -3157,7 +3157,7 @@
     </w:p>
     <w:p>
       <w:r>
-        <w:t>Repositorio base: https://github.com/BDecinti/Ecommerce-full-stack-2. Contratos y organización: README.md. Implementación: src y pruebas en tests. Esta especificación documenta la versión local preparada para revisión el 21 de octubre de 2026.</w:t>
+        <w:t>Repositorio base: https://github.com/BDecinti/Ecommerce-full-stack-2. Contratos y organización: README.md. Implementación y pruebas: src. Esta especificación documenta la versión local preparada para revisión el 23 de octubre de 2026.</w:t>
       </w:r>
     </w:p>
     <w:sectPr>

</xml_diff>